<commit_message>
Replace ASCII system diagram with prose paragraphs
The ASCII box-drawing diagram in section 2 rendered awkwardly in the
PDF — proportional fonts don't keep the boxes aligned. Replaced it
with two flowing paragraphs that describe the same six-module pipeline
and the single shared MLflow tracking server. Same information,
better academic typesetting.
</commit_message>
<xml_diff>
--- a/reports/project_report.docx
+++ b/reports/project_report.docx
@@ -292,70 +292,239 @@
           <w:color w:val="1A1A1A"/>
           <w:sz w:val="21"/>
         </w:rPr>
-        <w:t>The system is structured as six MLflow-managed stages:</w:t>
+        <w:t>The system is organised as six Python modules, each handling one stage of the machine-learning lifecycle. Every module logs its outputs to a single MLflow tracking server backed by a SQLite database and a local-filesystem artifact root.</w:t>
       </w:r>
     </w:p>
     <w:p>
       <w:pPr>
-        <w:spacing w:after="160" w:before="40"/>
-        <w:ind w:left="113"/>
-        <w:shd w:val="clear" w:color="auto" w:fill="F4F4F4"/>
-        <w:pBdr>
-          <w:top w:val="single" w:sz="4" w:space="4" w:color="B0B7C3"/>
-          <w:left w:val="single" w:sz="4" w:space="4" w:color="B0B7C3"/>
-          <w:bottom w:val="single" w:sz="4" w:space="4" w:color="B0B7C3"/>
-          <w:right w:val="single" w:sz="4" w:space="4" w:color="B0B7C3"/>
-        </w:pBdr>
+        <w:spacing w:after="120" w:line="312" w:lineRule="auto"/>
+        <w:jc w:val="both"/>
       </w:pPr>
+      <w:r>
+        <w:rPr>
+          <w:rFonts w:ascii="DejaVu Serif" w:hAnsi="DejaVu Serif"/>
+          <w:color w:val="1A1A1A"/>
+          <w:sz w:val="21"/>
+        </w:rPr>
+        <w:t xml:space="preserve">The pipeline starts with </w:t>
+      </w:r>
       <w:r>
         <w:rPr>
           <w:rFonts w:ascii="DejaVu Sans Mono" w:hAnsi="DejaVu Sans Mono"/>
           <w:color w:val="1A1A1A"/>
           <w:sz w:val="18"/>
+          <w:shd w:val="clear" w:color="auto" w:fill="F1F1F1"/>
         </w:rPr>
-        <w:t>┌──────────────┐     ┌──────────────┐     ┌──────────────┐</w:t>
-        <w:br/>
-        <w:t>│ data_loader  │ →   │  train.py    │ →   │  tune.py     │</w:t>
-        <w:br/>
-        <w:t>└──────────────┘     │ (3 baselines)│     │  (Hyperopt)  │</w:t>
-        <w:br/>
-        <w:t xml:space="preserve">                     └──────┬───────┘     └──────┬───────┘</w:t>
-        <w:br/>
-        <w:t xml:space="preserve">                            │                    │</w:t>
-        <w:br/>
-        <w:t xml:space="preserve">                            ▼                    ▼</w:t>
-        <w:br/>
-        <w:t xml:space="preserve">                     ┌──────────────────────────────────┐</w:t>
-        <w:br/>
-        <w:t xml:space="preserve">                     │   MLflow Tracking (SQLite + FS)  │</w:t>
-        <w:br/>
-        <w:t xml:space="preserve">                     └──────────────┬───────────────────┘</w:t>
-        <w:br/>
-        <w:t xml:space="preserve">                                    │</w:t>
-        <w:br/>
-        <w:t xml:space="preserve">                                    ▼</w:t>
-        <w:br/>
-        <w:t xml:space="preserve">                          ┌────────────────────┐</w:t>
-        <w:br/>
-        <w:t xml:space="preserve">                          │  Model Registry    │</w:t>
-        <w:br/>
-        <w:t xml:space="preserve">                          │  staging → prod    │</w:t>
-        <w:br/>
-        <w:t xml:space="preserve">                          └──────────┬─────────┘</w:t>
-        <w:br/>
-        <w:t xml:space="preserve">                                     │</w:t>
-        <w:br/>
-        <w:t xml:space="preserve">                          ┌──────────┴────────────┐</w:t>
-        <w:br/>
-        <w:t xml:space="preserve">                          ▼                       ▼</w:t>
-        <w:br/>
-        <w:t xml:space="preserve">                  ┌──────────────────┐    ┌──────────────┐</w:t>
-        <w:br/>
-        <w:t xml:space="preserve">                  │ mlflow models    │    │ monitor.py   │</w:t>
-        <w:br/>
-        <w:t xml:space="preserve">                  │ serve            │    │ (drift+perf) │</w:t>
-        <w:br/>
-        <w:t xml:space="preserve">                  └──────────────────┘    └──────────────┘</w:t>
+        <w:t>data_loader</w:t>
+      </w:r>
+      <w:r>
+        <w:rPr>
+          <w:rFonts w:ascii="DejaVu Serif" w:hAnsi="DejaVu Serif"/>
+          <w:color w:val="1A1A1A"/>
+          <w:sz w:val="21"/>
+        </w:rPr>
+        <w:t xml:space="preserve">, which loads the raw CSV, cleans the eleven malformed </w:t>
+      </w:r>
+      <w:r>
+        <w:rPr>
+          <w:rFonts w:ascii="DejaVu Sans Mono" w:hAnsi="DejaVu Sans Mono"/>
+          <w:color w:val="1A1A1A"/>
+          <w:sz w:val="18"/>
+          <w:shd w:val="clear" w:color="auto" w:fill="F1F1F1"/>
+        </w:rPr>
+        <w:t>TotalCharges</w:t>
+      </w:r>
+      <w:r>
+        <w:rPr>
+          <w:rFonts w:ascii="DejaVu Serif" w:hAnsi="DejaVu Serif"/>
+          <w:color w:val="1A1A1A"/>
+          <w:sz w:val="21"/>
+        </w:rPr>
+        <w:t xml:space="preserve"> rows, and produces stratified train, validation, and test splits. Those splits are consumed by </w:t>
+      </w:r>
+      <w:r>
+        <w:rPr>
+          <w:rFonts w:ascii="DejaVu Sans Mono" w:hAnsi="DejaVu Sans Mono"/>
+          <w:color w:val="1A1A1A"/>
+          <w:sz w:val="18"/>
+          <w:shd w:val="clear" w:color="auto" w:fill="F1F1F1"/>
+        </w:rPr>
+        <w:t>train.py</w:t>
+      </w:r>
+      <w:r>
+        <w:rPr>
+          <w:rFonts w:ascii="DejaVu Serif" w:hAnsi="DejaVu Serif"/>
+          <w:color w:val="1A1A1A"/>
+          <w:sz w:val="21"/>
+        </w:rPr>
+        <w:t xml:space="preserve">, which fits three baseline classifiers — LogisticRegression, RandomForestClassifier, and GradientBoostingClassifier — and logs the parameters, metrics, plots, and packaged model for each run. </w:t>
+      </w:r>
+      <w:r>
+        <w:rPr>
+          <w:rFonts w:ascii="DejaVu Sans Mono" w:hAnsi="DejaVu Sans Mono"/>
+          <w:color w:val="1A1A1A"/>
+          <w:sz w:val="18"/>
+          <w:shd w:val="clear" w:color="auto" w:fill="F1F1F1"/>
+        </w:rPr>
+        <w:t>tune.py</w:t>
+      </w:r>
+      <w:r>
+        <w:rPr>
+          <w:rFonts w:ascii="DejaVu Serif" w:hAnsi="DejaVu Serif"/>
+          <w:color w:val="1A1A1A"/>
+          <w:sz w:val="21"/>
+        </w:rPr>
+        <w:t xml:space="preserve"> then runs a Hyperopt Tree-structured Parzen Estimator search over the strongest model family, logging the parent search as one MLflow run with every trial as a nested child run.</w:t>
+      </w:r>
+    </w:p>
+    <w:p>
+      <w:pPr>
+        <w:spacing w:after="120" w:line="312" w:lineRule="auto"/>
+        <w:jc w:val="both"/>
+      </w:pPr>
+      <w:r>
+        <w:rPr>
+          <w:rFonts w:ascii="DejaVu Serif" w:hAnsi="DejaVu Serif"/>
+          <w:color w:val="1A1A1A"/>
+          <w:sz w:val="21"/>
+        </w:rPr>
+        <w:t xml:space="preserve">The best run discovered by either path is then handed to </w:t>
+      </w:r>
+      <w:r>
+        <w:rPr>
+          <w:rFonts w:ascii="DejaVu Sans Mono" w:hAnsi="DejaVu Sans Mono"/>
+          <w:color w:val="1A1A1A"/>
+          <w:sz w:val="18"/>
+          <w:shd w:val="clear" w:color="auto" w:fill="F1F1F1"/>
+        </w:rPr>
+        <w:t>registry.py</w:t>
+      </w:r>
+      <w:r>
+        <w:rPr>
+          <w:rFonts w:ascii="DejaVu Serif" w:hAnsi="DejaVu Serif"/>
+          <w:color w:val="1A1A1A"/>
+          <w:sz w:val="21"/>
+        </w:rPr>
+        <w:t xml:space="preserve">, which creates a new version of the registered model </w:t>
+      </w:r>
+      <w:r>
+        <w:rPr>
+          <w:rFonts w:ascii="DejaVu Sans Mono" w:hAnsi="DejaVu Sans Mono"/>
+          <w:color w:val="1A1A1A"/>
+          <w:sz w:val="18"/>
+          <w:shd w:val="clear" w:color="auto" w:fill="F1F1F1"/>
+        </w:rPr>
+        <w:t>telco-churn-classifier</w:t>
+      </w:r>
+      <w:r>
+        <w:rPr>
+          <w:rFonts w:ascii="DejaVu Serif" w:hAnsi="DejaVu Serif"/>
+          <w:color w:val="1A1A1A"/>
+          <w:sz w:val="21"/>
+        </w:rPr>
+        <w:t xml:space="preserve"> and promotes it through </w:t>
+      </w:r>
+      <w:r>
+        <w:rPr>
+          <w:rFonts w:ascii="DejaVu Sans Mono" w:hAnsi="DejaVu Sans Mono"/>
+          <w:color w:val="1A1A1A"/>
+          <w:sz w:val="18"/>
+          <w:shd w:val="clear" w:color="auto" w:fill="F1F1F1"/>
+        </w:rPr>
+        <w:t>@staging</w:t>
+      </w:r>
+      <w:r>
+        <w:rPr>
+          <w:rFonts w:ascii="DejaVu Serif" w:hAnsi="DejaVu Serif"/>
+          <w:color w:val="1A1A1A"/>
+          <w:sz w:val="21"/>
+        </w:rPr>
+        <w:t xml:space="preserve"> and </w:t>
+      </w:r>
+      <w:r>
+        <w:rPr>
+          <w:rFonts w:ascii="DejaVu Sans Mono" w:hAnsi="DejaVu Sans Mono"/>
+          <w:color w:val="1A1A1A"/>
+          <w:sz w:val="18"/>
+          <w:shd w:val="clear" w:color="auto" w:fill="F1F1F1"/>
+        </w:rPr>
+        <w:t>@production</w:t>
+      </w:r>
+      <w:r>
+        <w:rPr>
+          <w:rFonts w:ascii="DejaVu Serif" w:hAnsi="DejaVu Serif"/>
+          <w:color w:val="1A1A1A"/>
+          <w:sz w:val="21"/>
+        </w:rPr>
+        <w:t xml:space="preserve"> aliases. The production-aliased model is served via MLflow's built-in scoring server (</w:t>
+      </w:r>
+      <w:r>
+        <w:rPr>
+          <w:rFonts w:ascii="DejaVu Sans Mono" w:hAnsi="DejaVu Sans Mono"/>
+          <w:color w:val="1A1A1A"/>
+          <w:sz w:val="18"/>
+          <w:shd w:val="clear" w:color="auto" w:fill="F1F1F1"/>
+        </w:rPr>
+        <w:t>mlflow models serve</w:t>
+      </w:r>
+      <w:r>
+        <w:rPr>
+          <w:rFonts w:ascii="DejaVu Serif" w:hAnsi="DejaVu Serif"/>
+          <w:color w:val="1A1A1A"/>
+          <w:sz w:val="21"/>
+        </w:rPr>
+        <w:t xml:space="preserve">), which rehydrates the full scikit-learn pipeline — preprocessor and estimator together — and exposes it through a standard </w:t>
+      </w:r>
+      <w:r>
+        <w:rPr>
+          <w:rFonts w:ascii="DejaVu Sans Mono" w:hAnsi="DejaVu Sans Mono"/>
+          <w:color w:val="1A1A1A"/>
+          <w:sz w:val="18"/>
+          <w:shd w:val="clear" w:color="auto" w:fill="F1F1F1"/>
+        </w:rPr>
+        <w:t>/invocations</w:t>
+      </w:r>
+      <w:r>
+        <w:rPr>
+          <w:rFonts w:ascii="DejaVu Serif" w:hAnsi="DejaVu Serif"/>
+          <w:color w:val="1A1A1A"/>
+          <w:sz w:val="21"/>
+        </w:rPr>
+        <w:t xml:space="preserve"> endpoint. Finally, </w:t>
+      </w:r>
+      <w:r>
+        <w:rPr>
+          <w:rFonts w:ascii="DejaVu Sans Mono" w:hAnsi="DejaVu Sans Mono"/>
+          <w:color w:val="1A1A1A"/>
+          <w:sz w:val="18"/>
+          <w:shd w:val="clear" w:color="auto" w:fill="F1F1F1"/>
+        </w:rPr>
+        <w:t>monitor.py</w:t>
+      </w:r>
+      <w:r>
+        <w:rPr>
+          <w:rFonts w:ascii="DejaVu Serif" w:hAnsi="DejaVu Serif"/>
+          <w:color w:val="1A1A1A"/>
+          <w:sz w:val="21"/>
+        </w:rPr>
+        <w:t xml:space="preserve"> plays simulated production batches against that same registered model and logs input-distribution drift, statistical tests, and live performance metrics back to a dedicated </w:t>
+      </w:r>
+      <w:r>
+        <w:rPr>
+          <w:rFonts w:ascii="DejaVu Sans Mono" w:hAnsi="DejaVu Sans Mono"/>
+          <w:color w:val="1A1A1A"/>
+          <w:sz w:val="18"/>
+          <w:shd w:val="clear" w:color="auto" w:fill="F1F1F1"/>
+        </w:rPr>
+        <w:t>telco_churn_monitoring</w:t>
+      </w:r>
+      <w:r>
+        <w:rPr>
+          <w:rFonts w:ascii="DejaVu Serif" w:hAnsi="DejaVu Serif"/>
+          <w:color w:val="1A1A1A"/>
+          <w:sz w:val="21"/>
+        </w:rPr>
+        <w:t xml:space="preserve"> MLflow experiment so the time series of drift signals stays separate from training noise.</w:t>
       </w:r>
     </w:p>
     <w:p>

</xml_diff>

<commit_message>
Add GitHub repository URL to report cover & reproducibility section
Two places now reference the source repo:
  - Cover page meta block (under 'Academic year')
  - Section 6 Reproducibility table (first row)

This is Deliverable 1 in the brief — the grader needs to know where
the code lives.
</commit_message>
<xml_diff>
--- a/reports/project_report.docx
+++ b/reports/project_report.docx
@@ -136,6 +136,19 @@
           <w:sz w:val="22"/>
         </w:rPr>
         <w:t>Academic year: 2025–2026</w:t>
+      </w:r>
+    </w:p>
+    <w:p>
+      <w:pPr>
+        <w:jc w:val="center"/>
+      </w:pPr>
+      <w:r>
+        <w:rPr>
+          <w:rFonts w:ascii="DejaVu Serif" w:hAnsi="DejaVu Serif"/>
+          <w:color w:val="1A1A1A"/>
+          <w:sz w:val="22"/>
+        </w:rPr>
+        <w:t>Repository: github.com/mohameddribika/mlops_project</w:t>
       </w:r>
     </w:p>
     <w:p/>
@@ -4129,6 +4142,60 @@
                 <w:color w:val="1A1A1A"/>
                 <w:sz w:val="20"/>
               </w:rPr>
+              <w:t>Source repository</w:t>
+            </w:r>
+          </w:p>
+        </w:tc>
+        <w:tc>
+          <w:tcPr>
+            <w:tcW w:type="dxa" w:w="4703"/>
+            <w:tcBorders>
+              <w:top w:val="single" w:sz="4" w:color="B0B7C3"/>
+              <w:left w:val="single" w:sz="4" w:color="B0B7C3"/>
+              <w:bottom w:val="single" w:sz="4" w:color="B0B7C3"/>
+              <w:right w:val="single" w:sz="4" w:color="B0B7C3"/>
+            </w:tcBorders>
+          </w:tcPr>
+          <w:p>
+            <w:pPr>
+              <w:spacing w:after="0"/>
+            </w:pPr>
+            <w:r/>
+            <w:r>
+              <w:rPr>
+                <w:rFonts w:ascii="DejaVu Sans Mono" w:hAnsi="DejaVu Sans Mono"/>
+                <w:color w:val="1A1A1A"/>
+                <w:sz w:val="17"/>
+                <w:shd w:val="clear" w:color="auto" w:fill="F1F1F1"/>
+              </w:rPr>
+              <w:t>github.com/mohameddribika/mlops_project</w:t>
+            </w:r>
+          </w:p>
+        </w:tc>
+      </w:tr>
+      <w:tr>
+        <w:tc>
+          <w:tcPr>
+            <w:tcW w:type="dxa" w:w="4703"/>
+            <w:shd w:val="clear" w:color="auto" w:fill="F7F8FA"/>
+            <w:tcBorders>
+              <w:top w:val="single" w:sz="4" w:color="B0B7C3"/>
+              <w:left w:val="single" w:sz="4" w:color="B0B7C3"/>
+              <w:bottom w:val="single" w:sz="4" w:color="B0B7C3"/>
+              <w:right w:val="single" w:sz="4" w:color="B0B7C3"/>
+            </w:tcBorders>
+          </w:tcPr>
+          <w:p>
+            <w:pPr>
+              <w:spacing w:after="0"/>
+            </w:pPr>
+            <w:r/>
+            <w:r>
+              <w:rPr>
+                <w:rFonts w:ascii="DejaVu Serif" w:hAnsi="DejaVu Serif"/>
+                <w:color w:val="1A1A1A"/>
+                <w:sz w:val="20"/>
+              </w:rPr>
               <w:t>Python</w:t>
             </w:r>
           </w:p>
@@ -4136,6 +4203,7 @@
         <w:tc>
           <w:tcPr>
             <w:tcW w:type="dxa" w:w="4703"/>
+            <w:shd w:val="clear" w:color="auto" w:fill="F7F8FA"/>
             <w:tcBorders>
               <w:top w:val="single" w:sz="4" w:color="B0B7C3"/>
               <w:left w:val="single" w:sz="4" w:color="B0B7C3"/>
@@ -4163,7 +4231,6 @@
         <w:tc>
           <w:tcPr>
             <w:tcW w:type="dxa" w:w="4703"/>
-            <w:shd w:val="clear" w:color="auto" w:fill="F7F8FA"/>
             <w:tcBorders>
               <w:top w:val="single" w:sz="4" w:color="B0B7C3"/>
               <w:left w:val="single" w:sz="4" w:color="B0B7C3"/>
@@ -4189,7 +4256,6 @@
         <w:tc>
           <w:tcPr>
             <w:tcW w:type="dxa" w:w="4703"/>
-            <w:shd w:val="clear" w:color="auto" w:fill="F7F8FA"/>
             <w:tcBorders>
               <w:top w:val="single" w:sz="4" w:color="B0B7C3"/>
               <w:left w:val="single" w:sz="4" w:color="B0B7C3"/>
@@ -4243,6 +4309,7 @@
         <w:tc>
           <w:tcPr>
             <w:tcW w:type="dxa" w:w="4703"/>
+            <w:shd w:val="clear" w:color="auto" w:fill="F7F8FA"/>
             <w:tcBorders>
               <w:top w:val="single" w:sz="4" w:color="B0B7C3"/>
               <w:left w:val="single" w:sz="4" w:color="B0B7C3"/>
@@ -4268,6 +4335,7 @@
         <w:tc>
           <w:tcPr>
             <w:tcW w:type="dxa" w:w="4703"/>
+            <w:shd w:val="clear" w:color="auto" w:fill="F7F8FA"/>
             <w:tcBorders>
               <w:top w:val="single" w:sz="4" w:color="B0B7C3"/>
               <w:left w:val="single" w:sz="4" w:color="B0B7C3"/>
@@ -4296,7 +4364,6 @@
         <w:tc>
           <w:tcPr>
             <w:tcW w:type="dxa" w:w="4703"/>
-            <w:shd w:val="clear" w:color="auto" w:fill="F7F8FA"/>
             <w:tcBorders>
               <w:top w:val="single" w:sz="4" w:color="B0B7C3"/>
               <w:left w:val="single" w:sz="4" w:color="B0B7C3"/>
@@ -4315,14 +4382,13 @@
                 <w:color w:val="1A1A1A"/>
                 <w:sz w:val="20"/>
               </w:rPr>
-              <w:t>Dataset hash</w:t>
+              <w:t>Dataset</w:t>
             </w:r>
           </w:p>
         </w:tc>
         <w:tc>
           <w:tcPr>
             <w:tcW w:type="dxa" w:w="4703"/>
-            <w:shd w:val="clear" w:color="auto" w:fill="F7F8FA"/>
             <w:tcBorders>
               <w:top w:val="single" w:sz="4" w:color="B0B7C3"/>
               <w:left w:val="single" w:sz="4" w:color="B0B7C3"/>
@@ -4350,7 +4416,7 @@
                 <w:color w:val="1A1A1A"/>
                 <w:sz w:val="20"/>
               </w:rPr>
-              <w:t xml:space="preserve"> (948 KB, 7,043 rows) downloaded from the IBM mirror on GitHub</w:t>
+              <w:t xml:space="preserve"> (948 KB, 7,043 rows) — IBM Telco Customer Churn</w:t>
             </w:r>
           </w:p>
         </w:tc>

</xml_diff>